<commit_message>
updating to newest v1
</commit_message>
<xml_diff>
--- a/midthesis_details/thesis_word.docx
+++ b/midthesis_details/thesis_word.docx
@@ -1,6 +1,6 @@
 
 <file path=word/document.xml><?xml version="1.0" encoding="utf-8"?>
-<w:document xmlns:wpc="http://schemas.microsoft.com/office/word/2010/wordprocessingCanvas" xmlns:cx="http://schemas.microsoft.com/office/drawing/2014/chartex" xmlns:cx1="http://schemas.microsoft.com/office/drawing/2015/9/8/chartex" xmlns:cx2="http://schemas.microsoft.com/office/drawing/2015/10/21/chartex" xmlns:cx3="http://schemas.microsoft.com/office/drawing/2016/5/9/chartex" xmlns:cx4="http://schemas.microsoft.com/office/drawing/2016/5/10/chartex" xmlns:cx5="http://schemas.microsoft.com/office/drawing/2016/5/11/chartex" xmlns:cx6="http://schemas.microsoft.com/office/drawing/2016/5/12/chartex" xmlns:cx7="http://schemas.microsoft.com/office/drawing/2016/5/13/chartex" xmlns:cx8="http://schemas.microsoft.com/office/drawing/2016/5/14/chartex" xmlns:mc="http://schemas.openxmlformats.org/markup-compatibility/2006" xmlns:aink="http://schemas.microsoft.com/office/drawing/2016/ink" xmlns:am3d="http://schemas.microsoft.com/office/drawing/2017/model3d" xmlns:o="urn:schemas-microsoft-com:office:office" xmlns:oel="http://schemas.microsoft.com/office/2019/extlst" xmlns:r="http://schemas.openxmlformats.org/officeDocument/2006/relationships" xmlns:m="http://schemas.openxmlformats.org/officeDocument/2006/math" xmlns:v="urn:schemas-microsoft-com:vml" xmlns:wp14="http://schemas.microsoft.com/office/word/2010/wordprocessingDrawing" xmlns:wp="http://schemas.openxmlformats.org/drawingml/2006/wordprocessingDrawing" xmlns:w10="urn:schemas-microsoft-com:office:word" xmlns:w="http://schemas.openxmlformats.org/wordprocessingml/2006/main" xmlns:w14="http://schemas.microsoft.com/office/word/2010/wordml" xmlns:w15="http://schemas.microsoft.com/office/word/2012/wordml" xmlns:w16cex="http://schemas.microsoft.com/office/word/2018/wordml/cex" xmlns:w16cid="http://schemas.microsoft.com/office/word/2016/wordml/cid" xmlns:w16="http://schemas.microsoft.com/office/word/2018/wordml" xmlns:w16du="http://schemas.microsoft.com/office/word/2023/wordml/word16du" xmlns:w16sdtdh="http://schemas.microsoft.com/office/word/2020/wordml/sdtdatahash" xmlns:w16se="http://schemas.microsoft.com/office/word/2015/wordml/symex" xmlns:wpg="http://schemas.microsoft.com/office/word/2010/wordprocessingGroup" xmlns:wpi="http://schemas.microsoft.com/office/word/2010/wordprocessingInk" xmlns:wne="http://schemas.microsoft.com/office/word/2006/wordml" xmlns:wps="http://schemas.microsoft.com/office/word/2010/wordprocessingShape" mc:Ignorable="w14 w15 w16se w16cid w16 w16cex w16sdtdh w16du wp14">
+<w:document xmlns:wpc="http://schemas.microsoft.com/office/word/2010/wordprocessingCanvas" xmlns:cx="http://schemas.microsoft.com/office/drawing/2014/chartex" xmlns:cx1="http://schemas.microsoft.com/office/drawing/2015/9/8/chartex" xmlns:cx2="http://schemas.microsoft.com/office/drawing/2015/10/21/chartex" xmlns:cx3="http://schemas.microsoft.com/office/drawing/2016/5/9/chartex" xmlns:cx4="http://schemas.microsoft.com/office/drawing/2016/5/10/chartex" xmlns:cx5="http://schemas.microsoft.com/office/drawing/2016/5/11/chartex" xmlns:cx6="http://schemas.microsoft.com/office/drawing/2016/5/12/chartex" xmlns:cx7="http://schemas.microsoft.com/office/drawing/2016/5/13/chartex" xmlns:cx8="http://schemas.microsoft.com/office/drawing/2016/5/14/chartex" xmlns:mc="http://schemas.openxmlformats.org/markup-compatibility/2006" xmlns:aink="http://schemas.microsoft.com/office/drawing/2016/ink" xmlns:am3d="http://schemas.microsoft.com/office/drawing/2017/model3d" xmlns:o="urn:schemas-microsoft-com:office:office" xmlns:oel="http://schemas.microsoft.com/office/2019/extlst" xmlns:r="http://schemas.openxmlformats.org/officeDocument/2006/relationships" xmlns:m="http://schemas.openxmlformats.org/officeDocument/2006/math" xmlns:v="urn:schemas-microsoft-com:vml" xmlns:wp14="http://schemas.microsoft.com/office/word/2010/wordprocessingDrawing" xmlns:wp="http://schemas.openxmlformats.org/drawingml/2006/wordprocessingDrawing" xmlns:w10="urn:schemas-microsoft-com:office:word" xmlns:w="http://schemas.openxmlformats.org/wordprocessingml/2006/main" xmlns:w14="http://schemas.microsoft.com/office/word/2010/wordml" xmlns:w15="http://schemas.microsoft.com/office/word/2012/wordml" xmlns:w16cex="http://schemas.microsoft.com/office/word/2018/wordml/cex" xmlns:w16cid="http://schemas.microsoft.com/office/word/2016/wordml/cid" xmlns:w16="http://schemas.microsoft.com/office/word/2018/wordml" xmlns:w16du="http://schemas.microsoft.com/office/word/2023/wordml/word16du" xmlns:w16sdtdh="http://schemas.microsoft.com/office/word/2020/wordml/sdtdatahash" xmlns:w16sdtfl="http://schemas.microsoft.com/office/word/2024/wordml/sdtformatlock" xmlns:w16se="http://schemas.microsoft.com/office/word/2015/wordml/symex" xmlns:wpg="http://schemas.microsoft.com/office/word/2010/wordprocessingGroup" xmlns:wpi="http://schemas.microsoft.com/office/word/2010/wordprocessingInk" xmlns:wne="http://schemas.microsoft.com/office/word/2006/wordml" xmlns:wps="http://schemas.microsoft.com/office/word/2010/wordprocessingShape" mc:Ignorable="w14 w15 w16se w16cid w16 w16cex w16sdtdh w16sdtfl w16du wp14">
   <w:body>
     <w:p>
       <w:pPr>
@@ -2583,7 +2583,13 @@
                 <w:rPr>
                   <w:rFonts w:ascii="Cambria Math" w:eastAsiaTheme="minorEastAsia" w:hAnsi="Cambria Math"/>
                 </w:rPr>
-                <m:t>-2</m:t>
+                <m:t>-</m:t>
+              </m:r>
+              <m:r>
+                <w:rPr>
+                  <w:rFonts w:ascii="Cambria Math" w:eastAsiaTheme="minorEastAsia" w:hAnsi="Cambria Math"/>
+                </w:rPr>
+                <m:t>2</m:t>
               </m:r>
             </m:sup>
           </m:sSup>
@@ -2642,7 +2648,13 @@
                     <w:rPr>
                       <w:rFonts w:ascii="Cambria Math" w:eastAsiaTheme="minorEastAsia" w:hAnsi="Cambria Math"/>
                     </w:rPr>
-                    <m:t>-1</m:t>
+                    <m:t>-</m:t>
+                  </m:r>
+                  <m:r>
+                    <w:rPr>
+                      <w:rFonts w:ascii="Cambria Math" w:eastAsiaTheme="minorEastAsia" w:hAnsi="Cambria Math"/>
+                    </w:rPr>
+                    <m:t>1</m:t>
                   </m:r>
                 </m:sup>
               </m:sSup>
@@ -2667,7 +2679,13 @@
                 <w:rPr>
                   <w:rFonts w:ascii="Cambria Math" w:eastAsiaTheme="minorEastAsia" w:hAnsi="Cambria Math"/>
                 </w:rPr>
-                <m:t>-1</m:t>
+                <m:t>-</m:t>
+              </m:r>
+              <m:r>
+                <w:rPr>
+                  <w:rFonts w:ascii="Cambria Math" w:eastAsiaTheme="minorEastAsia" w:hAnsi="Cambria Math"/>
+                </w:rPr>
+                <m:t>1</m:t>
               </m:r>
               <m:ctrlPr>
                 <w:rPr>
@@ -2681,7 +2699,19 @@
             <w:rPr>
               <w:rFonts w:ascii="Cambria Math" w:eastAsiaTheme="minorEastAsia" w:hAnsi="Cambria Math"/>
             </w:rPr>
-            <m:t>+C,</m:t>
+            <m:t>+</m:t>
+          </m:r>
+          <m:r>
+            <w:rPr>
+              <w:rFonts w:ascii="Cambria Math" w:eastAsiaTheme="minorEastAsia" w:hAnsi="Cambria Math"/>
+            </w:rPr>
+            <m:t>C</m:t>
+          </m:r>
+          <m:r>
+            <w:rPr>
+              <w:rFonts w:ascii="Cambria Math" w:eastAsiaTheme="minorEastAsia" w:hAnsi="Cambria Math"/>
+            </w:rPr>
+            <m:t>,</m:t>
           </m:r>
         </m:oMath>
       </m:oMathPara>
@@ -2896,13 +2926,7 @@
                 <w:rPr>
                   <w:rFonts w:ascii="Cambria Math" w:eastAsiaTheme="minorEastAsia" w:hAnsi="Cambria Math"/>
                 </w:rPr>
-                <m:t>c</m:t>
-              </m:r>
-              <m:r>
-                <w:rPr>
-                  <w:rFonts w:ascii="Cambria Math" w:eastAsiaTheme="minorEastAsia" w:hAnsi="Cambria Math"/>
-                </w:rPr>
-                <m:t>Q</m:t>
+                <m:t>cQ</m:t>
               </m:r>
             </m:sub>
           </m:sSub>
@@ -3021,6 +3045,85 @@
           <w:rFonts w:eastAsiaTheme="minorEastAsia"/>
         </w:rPr>
       </w:pPr>
+      <m:oMathPara>
+        <m:oMath>
+          <m:sSub>
+            <m:sSubPr>
+              <m:ctrlPr>
+                <w:rPr>
+                  <w:rFonts w:ascii="Cambria Math" w:eastAsiaTheme="minorEastAsia" w:hAnsi="Cambria Math"/>
+                  <w:i/>
+                </w:rPr>
+              </m:ctrlPr>
+            </m:sSubPr>
+            <m:e>
+              <m:r>
+                <m:rPr>
+                  <m:sty m:val="p"/>
+                </m:rPr>
+                <w:rPr>
+                  <w:rFonts w:ascii="Cambria Math" w:eastAsiaTheme="minorEastAsia" w:hAnsi="Cambria Math"/>
+                </w:rPr>
+                <m:t>Δ</m:t>
+              </m:r>
+              <m:ctrlPr>
+                <w:rPr>
+                  <w:rFonts w:ascii="Cambria Math" w:eastAsiaTheme="minorEastAsia" w:hAnsi="Cambria Math"/>
+                </w:rPr>
+              </m:ctrlPr>
+            </m:e>
+            <m:sub>
+              <m:r>
+                <w:rPr>
+                  <w:rFonts w:ascii="Cambria Math" w:eastAsiaTheme="minorEastAsia" w:hAnsi="Cambria Math"/>
+                </w:rPr>
+                <m:t>P</m:t>
+              </m:r>
+            </m:sub>
+          </m:sSub>
+        </m:oMath>
+      </m:oMathPara>
+    </w:p>
+    <w:p>
+      <w:pPr>
+        <w:rPr>
+          <w:rFonts w:eastAsiaTheme="minorEastAsia"/>
+        </w:rPr>
+      </w:pPr>
+      <w:r>
+        <w:rPr>
+          <w:rFonts w:eastAsiaTheme="minorEastAsia"/>
+        </w:rPr>
+        <w:t>\frac{</w:t>
+      </w:r>
+      <w:proofErr w:type="spellStart"/>
+      <w:r>
+        <w:rPr>
+          <w:rFonts w:eastAsiaTheme="minorEastAsia"/>
+        </w:rPr>
+        <w:t>dM</w:t>
+      </w:r>
+      <w:proofErr w:type="spellEnd"/>
+      <w:r>
+        <w:rPr>
+          <w:rFonts w:eastAsiaTheme="minorEastAsia"/>
+        </w:rPr>
+        <w:t>(r)}{</w:t>
+      </w:r>
+      <w:proofErr w:type="spellStart"/>
+      <w:r>
+        <w:rPr>
+          <w:rFonts w:eastAsiaTheme="minorEastAsia"/>
+        </w:rPr>
+        <w:t>dr</w:t>
+      </w:r>
+      <w:proofErr w:type="spellEnd"/>
+      <w:r>
+        <w:rPr>
+          <w:rFonts w:eastAsiaTheme="minorEastAsia"/>
+        </w:rPr>
+        <w:t>} = 4\pi r^2 \epsilon(r)</w:t>
+      </w:r>
     </w:p>
     <w:p>
       <w:pPr>
@@ -3035,6 +3138,519 @@
           <w:rFonts w:eastAsiaTheme="minorEastAsia"/>
         </w:rPr>
       </w:pPr>
+      <m:oMathPara>
+        <m:oMath>
+          <m:f>
+            <m:fPr>
+              <m:ctrlPr>
+                <w:rPr>
+                  <w:rFonts w:ascii="Cambria Math" w:eastAsiaTheme="minorEastAsia" w:hAnsi="Cambria Math"/>
+                </w:rPr>
+              </m:ctrlPr>
+            </m:fPr>
+            <m:num>
+              <m:r>
+                <w:rPr>
+                  <w:rFonts w:ascii="Cambria Math" w:eastAsiaTheme="minorEastAsia" w:hAnsi="Cambria Math"/>
+                </w:rPr>
+                <m:t>dM</m:t>
+              </m:r>
+              <m:d>
+                <m:dPr>
+                  <m:ctrlPr>
+                    <w:rPr>
+                      <w:rFonts w:ascii="Cambria Math" w:eastAsiaTheme="minorEastAsia" w:hAnsi="Cambria Math"/>
+                      <w:i/>
+                    </w:rPr>
+                  </m:ctrlPr>
+                </m:dPr>
+                <m:e>
+                  <m:r>
+                    <w:rPr>
+                      <w:rFonts w:ascii="Cambria Math" w:eastAsiaTheme="minorEastAsia" w:hAnsi="Cambria Math"/>
+                    </w:rPr>
+                    <m:t>r</m:t>
+                  </m:r>
+                </m:e>
+              </m:d>
+              <m:ctrlPr>
+                <w:rPr>
+                  <w:rFonts w:ascii="Cambria Math" w:eastAsiaTheme="minorEastAsia" w:hAnsi="Cambria Math"/>
+                  <w:i/>
+                </w:rPr>
+              </m:ctrlPr>
+            </m:num>
+            <m:den>
+              <m:r>
+                <w:rPr>
+                  <w:rFonts w:ascii="Cambria Math" w:eastAsiaTheme="minorEastAsia" w:hAnsi="Cambria Math"/>
+                </w:rPr>
+                <m:t>dr</m:t>
+              </m:r>
+              <m:ctrlPr>
+                <w:rPr>
+                  <w:rFonts w:ascii="Cambria Math" w:eastAsiaTheme="minorEastAsia" w:hAnsi="Cambria Math"/>
+                  <w:i/>
+                </w:rPr>
+              </m:ctrlPr>
+            </m:den>
+          </m:f>
+          <m:r>
+            <w:rPr>
+              <w:rFonts w:ascii="Cambria Math" w:eastAsiaTheme="minorEastAsia" w:hAnsi="Cambria Math"/>
+            </w:rPr>
+            <m:t>=4</m:t>
+          </m:r>
+          <m:r>
+            <m:rPr>
+              <m:sty m:val="p"/>
+            </m:rPr>
+            <w:rPr>
+              <w:rFonts w:ascii="Cambria Math" w:eastAsiaTheme="minorEastAsia" w:hAnsi="Cambria Math"/>
+            </w:rPr>
+            <m:t>π</m:t>
+          </m:r>
+          <m:sSup>
+            <m:sSupPr>
+              <m:ctrlPr>
+                <w:rPr>
+                  <w:rFonts w:ascii="Cambria Math" w:eastAsiaTheme="minorEastAsia" w:hAnsi="Cambria Math"/>
+                  <w:i/>
+                </w:rPr>
+              </m:ctrlPr>
+            </m:sSupPr>
+            <m:e>
+              <m:r>
+                <w:rPr>
+                  <w:rFonts w:ascii="Cambria Math" w:eastAsiaTheme="minorEastAsia" w:hAnsi="Cambria Math"/>
+                </w:rPr>
+                <m:t>r</m:t>
+              </m:r>
+            </m:e>
+            <m:sup>
+              <m:r>
+                <w:rPr>
+                  <w:rFonts w:ascii="Cambria Math" w:eastAsiaTheme="minorEastAsia" w:hAnsi="Cambria Math"/>
+                </w:rPr>
+                <m:t>2</m:t>
+              </m:r>
+            </m:sup>
+          </m:sSup>
+          <m:r>
+            <m:rPr>
+              <m:sty m:val="p"/>
+            </m:rPr>
+            <w:rPr>
+              <w:rFonts w:ascii="Cambria Math" w:eastAsiaTheme="minorEastAsia" w:hAnsi="Cambria Math"/>
+            </w:rPr>
+            <m:t>ϵ</m:t>
+          </m:r>
+          <m:d>
+            <m:dPr>
+              <m:ctrlPr>
+                <w:rPr>
+                  <w:rFonts w:ascii="Cambria Math" w:eastAsiaTheme="minorEastAsia" w:hAnsi="Cambria Math"/>
+                  <w:i/>
+                </w:rPr>
+              </m:ctrlPr>
+            </m:dPr>
+            <m:e>
+              <m:r>
+                <w:rPr>
+                  <w:rFonts w:ascii="Cambria Math" w:eastAsiaTheme="minorEastAsia" w:hAnsi="Cambria Math"/>
+                </w:rPr>
+                <m:t>r</m:t>
+              </m:r>
+            </m:e>
+          </m:d>
+        </m:oMath>
+      </m:oMathPara>
+    </w:p>
+    <w:p>
+      <w:pPr>
+        <w:rPr>
+          <w:rFonts w:eastAsiaTheme="minorEastAsia"/>
+        </w:rPr>
+      </w:pPr>
+    </w:p>
+    <w:p>
+      <w:pPr>
+        <w:rPr>
+          <w:rFonts w:eastAsiaTheme="minorEastAsia"/>
+        </w:rPr>
+      </w:pPr>
+    </w:p>
+    <w:p>
+      <w:pPr>
+        <w:rPr>
+          <w:rFonts w:eastAsiaTheme="minorEastAsia"/>
+        </w:rPr>
+      </w:pPr>
+      <m:oMathPara>
+        <m:oMath>
+          <m:sSub>
+            <m:sSubPr>
+              <m:ctrlPr>
+                <w:rPr>
+                  <w:rFonts w:ascii="Cambria Math" w:eastAsiaTheme="minorEastAsia" w:hAnsi="Cambria Math"/>
+                  <w:i/>
+                </w:rPr>
+              </m:ctrlPr>
+            </m:sSubPr>
+            <m:e>
+              <m:r>
+                <m:rPr>
+                  <m:sty m:val="p"/>
+                </m:rPr>
+                <w:rPr>
+                  <w:rFonts w:ascii="Cambria Math" w:eastAsiaTheme="minorEastAsia" w:hAnsi="Cambria Math"/>
+                </w:rPr>
+                <m:t>Γ</m:t>
+              </m:r>
+              <m:ctrlPr>
+                <w:rPr>
+                  <w:rFonts w:ascii="Cambria Math" w:eastAsiaTheme="minorEastAsia" w:hAnsi="Cambria Math"/>
+                </w:rPr>
+              </m:ctrlPr>
+            </m:e>
+            <m:sub>
+              <m:r>
+                <w:rPr>
+                  <w:rFonts w:ascii="Cambria Math" w:eastAsiaTheme="minorEastAsia" w:hAnsi="Cambria Math"/>
+                </w:rPr>
+                <m:t>Q</m:t>
+              </m:r>
+            </m:sub>
+          </m:sSub>
+        </m:oMath>
+      </m:oMathPara>
+    </w:p>
+    <w:p>
+      <w:pPr>
+        <w:rPr>
+          <w:rFonts w:eastAsiaTheme="minorEastAsia"/>
+        </w:rPr>
+      </w:pPr>
+      <w:r>
+        <w:rPr>
+          <w:rFonts w:eastAsiaTheme="minorEastAsia"/>
+        </w:rPr>
+        <w:t>\mu_{c}</w:t>
+      </w:r>
+    </w:p>
+    <w:p>
+      <w:pPr>
+        <w:rPr>
+          <w:rFonts w:eastAsiaTheme="minorEastAsia"/>
+        </w:rPr>
+      </w:pPr>
+      <m:oMathPara>
+        <m:oMath>
+          <m:sSub>
+            <m:sSubPr>
+              <m:ctrlPr>
+                <w:rPr>
+                  <w:rFonts w:ascii="Cambria Math" w:eastAsiaTheme="minorEastAsia" w:hAnsi="Cambria Math"/>
+                  <w:i/>
+                </w:rPr>
+              </m:ctrlPr>
+            </m:sSubPr>
+            <m:e>
+              <m:r>
+                <m:rPr>
+                  <m:sty m:val="p"/>
+                </m:rPr>
+                <w:rPr>
+                  <w:rFonts w:ascii="Cambria Math" w:eastAsiaTheme="minorEastAsia" w:hAnsi="Cambria Math"/>
+                </w:rPr>
+                <m:t>μ</m:t>
+              </m:r>
+              <m:ctrlPr>
+                <w:rPr>
+                  <w:rFonts w:ascii="Cambria Math" w:eastAsiaTheme="minorEastAsia" w:hAnsi="Cambria Math"/>
+                </w:rPr>
+              </m:ctrlPr>
+            </m:e>
+            <m:sub>
+              <m:r>
+                <w:rPr>
+                  <w:rFonts w:ascii="Cambria Math" w:eastAsiaTheme="minorEastAsia" w:hAnsi="Cambria Math"/>
+                </w:rPr>
+                <m:t>c</m:t>
+              </m:r>
+            </m:sub>
+          </m:sSub>
+        </m:oMath>
+      </m:oMathPara>
+    </w:p>
+    <w:p>
+      <w:pPr>
+        <w:rPr>
+          <w:rFonts w:eastAsiaTheme="minorEastAsia"/>
+          <w:noProof/>
+        </w:rPr>
+      </w:pPr>
+      <w:r>
+        <w:rPr>
+          <w:rFonts w:eastAsiaTheme="minorEastAsia"/>
+          <w:noProof/>
+        </w:rPr>
+        <w:lastRenderedPageBreak/>
+        <w:drawing>
+          <wp:inline distT="0" distB="0" distL="0" distR="0" wp14:anchorId="3851AED6" wp14:editId="30AD2CBF">
+            <wp:extent cx="4842525" cy="3763334"/>
+            <wp:effectExtent l="0" t="0" r="0" b="0"/>
+            <wp:docPr id="5" name="Picture 4" descr="A graph with a line&#10;&#10;Description automatically generated">
+              <a:extLst xmlns:a="http://schemas.openxmlformats.org/drawingml/2006/main">
+                <a:ext uri="{FF2B5EF4-FFF2-40B4-BE49-F238E27FC236}">
+                  <a16:creationId xmlns:a16="http://schemas.microsoft.com/office/drawing/2014/main" id="{DD3FEC1F-5280-BD73-353B-BE4E9DCCDD33}"/>
+                </a:ext>
+              </a:extLst>
+            </wp:docPr>
+            <wp:cNvGraphicFramePr>
+              <a:graphicFrameLocks xmlns:a="http://schemas.openxmlformats.org/drawingml/2006/main" noChangeAspect="1"/>
+            </wp:cNvGraphicFramePr>
+            <a:graphic xmlns:a="http://schemas.openxmlformats.org/drawingml/2006/main">
+              <a:graphicData uri="http://schemas.openxmlformats.org/drawingml/2006/picture">
+                <pic:pic xmlns:pic="http://schemas.openxmlformats.org/drawingml/2006/picture">
+                  <pic:nvPicPr>
+                    <pic:cNvPr id="5" name="Picture 4" descr="A graph with a line&#10;&#10;Description automatically generated">
+                      <a:extLst>
+                        <a:ext uri="{FF2B5EF4-FFF2-40B4-BE49-F238E27FC236}">
+                          <a16:creationId xmlns:a16="http://schemas.microsoft.com/office/drawing/2014/main" id="{DD3FEC1F-5280-BD73-353B-BE4E9DCCDD33}"/>
+                        </a:ext>
+                      </a:extLst>
+                    </pic:cNvPr>
+                    <pic:cNvPicPr>
+                      <a:picLocks noChangeAspect="1"/>
+                    </pic:cNvPicPr>
+                  </pic:nvPicPr>
+                  <pic:blipFill>
+                    <a:blip r:embed="rId5"/>
+                    <a:stretch>
+                      <a:fillRect/>
+                    </a:stretch>
+                  </pic:blipFill>
+                  <pic:spPr>
+                    <a:xfrm>
+                      <a:off x="0" y="0"/>
+                      <a:ext cx="4842525" cy="3763334"/>
+                    </a:xfrm>
+                    <a:prstGeom prst="rect">
+                      <a:avLst/>
+                    </a:prstGeom>
+                  </pic:spPr>
+                </pic:pic>
+              </a:graphicData>
+            </a:graphic>
+          </wp:inline>
+        </w:drawing>
+      </w:r>
+      <w:r>
+        <w:rPr>
+          <w:rFonts w:eastAsiaTheme="minorEastAsia"/>
+          <w:noProof/>
+        </w:rPr>
+        <w:lastRenderedPageBreak/>
+        <w:drawing>
+          <wp:inline distT="0" distB="0" distL="0" distR="0" wp14:anchorId="2114E6F6" wp14:editId="5DF51A64">
+            <wp:extent cx="4953000" cy="5410200"/>
+            <wp:effectExtent l="0" t="0" r="0" b="0"/>
+            <wp:docPr id="930010595" name="Picture 1" descr="A graph of a graph&#10;&#10;Description automatically generated"/>
+            <wp:cNvGraphicFramePr>
+              <a:graphicFrameLocks xmlns:a="http://schemas.openxmlformats.org/drawingml/2006/main" noChangeAspect="1"/>
+            </wp:cNvGraphicFramePr>
+            <a:graphic xmlns:a="http://schemas.openxmlformats.org/drawingml/2006/main">
+              <a:graphicData uri="http://schemas.openxmlformats.org/drawingml/2006/picture">
+                <pic:pic xmlns:pic="http://schemas.openxmlformats.org/drawingml/2006/picture">
+                  <pic:nvPicPr>
+                    <pic:cNvPr id="930010595" name="Picture 1" descr="A graph of a graph&#10;&#10;Description automatically generated"/>
+                    <pic:cNvPicPr/>
+                  </pic:nvPicPr>
+                  <pic:blipFill>
+                    <a:blip r:embed="rId6"/>
+                    <a:stretch>
+                      <a:fillRect/>
+                    </a:stretch>
+                  </pic:blipFill>
+                  <pic:spPr>
+                    <a:xfrm>
+                      <a:off x="0" y="0"/>
+                      <a:ext cx="4953000" cy="5410200"/>
+                    </a:xfrm>
+                    <a:prstGeom prst="rect">
+                      <a:avLst/>
+                    </a:prstGeom>
+                  </pic:spPr>
+                </pic:pic>
+              </a:graphicData>
+            </a:graphic>
+          </wp:inline>
+        </w:drawing>
+      </w:r>
+    </w:p>
+    <w:p>
+      <w:pPr>
+        <w:rPr>
+          <w:rFonts w:eastAsiaTheme="minorEastAsia"/>
+        </w:rPr>
+      </w:pPr>
+    </w:p>
+    <w:p>
+      <w:pPr>
+        <w:rPr>
+          <w:rFonts w:eastAsiaTheme="minorEastAsia"/>
+        </w:rPr>
+      </w:pPr>
+    </w:p>
+    <w:p>
+      <w:pPr>
+        <w:rPr>
+          <w:rFonts w:eastAsiaTheme="minorEastAsia"/>
+        </w:rPr>
+      </w:pPr>
+    </w:p>
+    <w:p>
+      <w:pPr>
+        <w:rPr>
+          <w:rFonts w:eastAsiaTheme="minorEastAsia"/>
+        </w:rPr>
+      </w:pPr>
+    </w:p>
+    <w:p>
+      <w:pPr>
+        <w:rPr>
+          <w:rFonts w:eastAsiaTheme="minorEastAsia"/>
+          <w:noProof/>
+        </w:rPr>
+      </w:pPr>
+    </w:p>
+    <w:p>
+      <w:pPr>
+        <w:jc w:val="center"/>
+        <w:rPr>
+          <w:rFonts w:eastAsiaTheme="minorEastAsia"/>
+          <w:noProof/>
+        </w:rPr>
+      </w:pPr>
+      <m:oMathPara>
+        <m:oMath>
+          <m:sSub>
+            <m:sSubPr>
+              <m:ctrlPr>
+                <w:rPr>
+                  <w:rFonts w:ascii="Cambria Math" w:eastAsiaTheme="minorEastAsia" w:hAnsi="Cambria Math"/>
+                  <w:i/>
+                </w:rPr>
+              </m:ctrlPr>
+            </m:sSubPr>
+            <m:e>
+              <m:r>
+                <w:rPr>
+                  <w:rFonts w:ascii="Cambria Math" w:eastAsiaTheme="minorEastAsia" w:hAnsi="Cambria Math"/>
+                </w:rPr>
+                <m:t>c</m:t>
+              </m:r>
+            </m:e>
+            <m:sub>
+              <m:sSup>
+                <m:sSupPr>
+                  <m:ctrlPr>
+                    <w:rPr>
+                      <w:rFonts w:ascii="Cambria Math" w:eastAsiaTheme="minorEastAsia" w:hAnsi="Cambria Math"/>
+                      <w:i/>
+                    </w:rPr>
+                  </m:ctrlPr>
+                </m:sSupPr>
+                <m:e>
+                  <m:r>
+                    <w:rPr>
+                      <w:rFonts w:ascii="Cambria Math" w:eastAsiaTheme="minorEastAsia" w:hAnsi="Cambria Math"/>
+                    </w:rPr>
+                    <m:t>s</m:t>
+                  </m:r>
+                </m:e>
+                <m:sup>
+                  <m:r>
+                    <w:rPr>
+                      <w:rFonts w:ascii="Cambria Math" w:eastAsiaTheme="minorEastAsia" w:hAnsi="Cambria Math"/>
+                    </w:rPr>
+                    <m:t>2</m:t>
+                  </m:r>
+                </m:sup>
+              </m:sSup>
+            </m:sub>
+          </m:sSub>
+          <m:r>
+            <w:rPr>
+              <w:rFonts w:ascii="Cambria Math" w:eastAsiaTheme="minorEastAsia" w:hAnsi="Cambria Math"/>
+            </w:rPr>
+            <m:t>=</m:t>
+          </m:r>
+          <m:f>
+            <m:fPr>
+              <m:ctrlPr>
+                <w:rPr>
+                  <w:rFonts w:ascii="Cambria Math" w:eastAsiaTheme="minorEastAsia" w:hAnsi="Cambria Math"/>
+                </w:rPr>
+              </m:ctrlPr>
+            </m:fPr>
+            <m:num>
+              <m:r>
+                <w:rPr>
+                  <w:rFonts w:ascii="Cambria Math" w:eastAsiaTheme="minorEastAsia" w:hAnsi="Cambria Math"/>
+                </w:rPr>
+                <m:t>dP</m:t>
+              </m:r>
+              <m:ctrlPr>
+                <w:rPr>
+                  <w:rFonts w:ascii="Cambria Math" w:eastAsiaTheme="minorEastAsia" w:hAnsi="Cambria Math"/>
+                  <w:i/>
+                </w:rPr>
+              </m:ctrlPr>
+            </m:num>
+            <m:den>
+              <m:r>
+                <w:rPr>
+                  <w:rFonts w:ascii="Cambria Math" w:eastAsiaTheme="minorEastAsia" w:hAnsi="Cambria Math"/>
+                </w:rPr>
+                <m:t>d</m:t>
+              </m:r>
+              <m:r>
+                <m:rPr>
+                  <m:sty m:val="p"/>
+                </m:rPr>
+                <w:rPr>
+                  <w:rFonts w:ascii="Cambria Math" w:eastAsiaTheme="minorEastAsia" w:hAnsi="Cambria Math"/>
+                </w:rPr>
+                <m:t>ϵ</m:t>
+              </m:r>
+              <m:ctrlPr>
+                <w:rPr>
+                  <w:rFonts w:ascii="Cambria Math" w:eastAsiaTheme="minorEastAsia" w:hAnsi="Cambria Math"/>
+                  <w:i/>
+                </w:rPr>
+              </m:ctrlPr>
+            </m:den>
+          </m:f>
+        </m:oMath>
+      </m:oMathPara>
+    </w:p>
+    <w:p>
+      <w:pPr>
+        <w:jc w:val="center"/>
+        <w:rPr>
+          <w:rFonts w:eastAsiaTheme="minorEastAsia"/>
+          <w:noProof/>
+        </w:rPr>
+      </w:pPr>
+      <w:r>
+        <w:rPr>
+          <w:rFonts w:ascii="Cambria Math" w:eastAsiaTheme="minorEastAsia" w:hAnsi="Cambria Math"/>
+          <w:i/>
+        </w:rPr>
+        <w:t>}</w:t>
+      </w:r>
     </w:p>
     <w:sectPr>
       <w:pgSz w:w="11906" w:h="16838"/>
@@ -3047,7 +3663,7 @@
 </file>
 
 <file path=word/styles.xml><?xml version="1.0" encoding="utf-8"?>
-<w:styles xmlns:mc="http://schemas.openxmlformats.org/markup-compatibility/2006" xmlns:r="http://schemas.openxmlformats.org/officeDocument/2006/relationships" xmlns:w="http://schemas.openxmlformats.org/wordprocessingml/2006/main" xmlns:w14="http://schemas.microsoft.com/office/word/2010/wordml" xmlns:w15="http://schemas.microsoft.com/office/word/2012/wordml" xmlns:w16cex="http://schemas.microsoft.com/office/word/2018/wordml/cex" xmlns:w16cid="http://schemas.microsoft.com/office/word/2016/wordml/cid" xmlns:w16="http://schemas.microsoft.com/office/word/2018/wordml" xmlns:w16du="http://schemas.microsoft.com/office/word/2023/wordml/word16du" xmlns:w16sdtdh="http://schemas.microsoft.com/office/word/2020/wordml/sdtdatahash" xmlns:w16se="http://schemas.microsoft.com/office/word/2015/wordml/symex" mc:Ignorable="w14 w15 w16se w16cid w16 w16cex w16sdtdh w16du">
+<w:styles xmlns:mc="http://schemas.openxmlformats.org/markup-compatibility/2006" xmlns:r="http://schemas.openxmlformats.org/officeDocument/2006/relationships" xmlns:w="http://schemas.openxmlformats.org/wordprocessingml/2006/main" xmlns:w14="http://schemas.microsoft.com/office/word/2010/wordml" xmlns:w15="http://schemas.microsoft.com/office/word/2012/wordml" xmlns:w16cex="http://schemas.microsoft.com/office/word/2018/wordml/cex" xmlns:w16cid="http://schemas.microsoft.com/office/word/2016/wordml/cid" xmlns:w16="http://schemas.microsoft.com/office/word/2018/wordml" xmlns:w16du="http://schemas.microsoft.com/office/word/2023/wordml/word16du" xmlns:w16sdtdh="http://schemas.microsoft.com/office/word/2020/wordml/sdtdatahash" xmlns:w16sdtfl="http://schemas.microsoft.com/office/word/2024/wordml/sdtformatlock" xmlns:w16se="http://schemas.microsoft.com/office/word/2015/wordml/symex" mc:Ignorable="w14 w15 w16se w16cid w16 w16cex w16sdtdh w16sdtfl w16du">
   <w:docDefaults>
     <w:rPrDefault>
       <w:rPr>

</xml_diff>